<commit_message>
docs: overhaul project documentation
Create a current, reader-focused documentation hub for Production version 33 and Backend/Admin 5.18.6. Add architecture, development, deployment, operations, security, troubleshooting, release history and generated inventory guides; refresh Playbook Word/PDF references; preserve curated indexes; and mark all legacy release notes as historical.

Validation: 96 Markdown files checked; 0 broken local links; 0 unclosed code fences; 67/67 historical release notices; organizer syntax, preview and idempotency verified; Word/PDF rendered across 17 pages; credential scan clean.

Docs and documentation tooling only. No database migration or application deployment.
</commit_message>
<xml_diff>
--- a/docs/VS_Enterprise_IT_HelpDesk_Playbook_2026.docx
+++ b/docs/VS_Enterprise_IT_HelpDesk_Playbook_2026.docx
@@ -83,7 +83,7 @@
                 <w:b w:val="0"/>
                 <w:sz w:val="18"/>
               </w:rPr>
-              <w:t>1.0.0 - 05/08/2026</w:t>
+              <w:t>1.1.0 - 03/09/2026</w:t>
             </w:r>
           </w:p>
         </w:tc>
@@ -1611,7 +1611,7 @@
         <w:pStyle w:val="ListBullet"/>
       </w:pPr>
       <w:r>
-        <w:t>Tìm lexical và semantic trong 173 procedure</w:t>
+        <w:t>Tìm lexical hoặc hybrid trong các procedure Published + Active</w:t>
       </w:r>
     </w:p>
     <w:p>
@@ -1635,7 +1635,7 @@
         <w:pStyle w:val="ListBullet"/>
       </w:pPr>
       <w:r>
-        <w:t>Qwen soạn phản hồi có JSON Schema</w:t>
+        <w:t>Cloud AI Router soạn phản hồi có JSON Schema; Rules fallback khi cần</w:t>
       </w:r>
     </w:p>
     <w:p>

</xml_diff>